<commit_message>
docs: finalize v1.5 report — widen dev period, clear resolved known issues
v1.5 is deployed and running on Abacus. Extends the documented dev period
to 10.08-13.08 & 17.08.2026 (report date 18.08.2026) and drops known-issue/
plan items that are now resolved: PGL price history migration (013), new
steel type PGL/history migrations (016/017), contact-sync migration, and
the min-margin/offer-versioning migrations (014/015). Also fixes v1.4's
dev-period end date (4.08 -> 10.08.2026).
</commit_message>
<xml_diff>
--- a/Historia wersji oraz md/Historia wersji/AMSteel_Quote_Raport_Wersji_1.4.docx
+++ b/Historia wersji oraz md/Historia wersji/AMSteel_Quote_Raport_Wersji_1.4.docx
@@ -236,7 +236,7 @@
               <w:rPr>
                 <w:color w:val="666666"/>
               </w:rPr>
-              <w:t>04</w:t>
+              <w:t>10</w:t>
             </w:r>
             <w:r>
               <w:rPr>
@@ -305,7 +305,7 @@
               <w:rPr>
                 <w:color w:val="666666"/>
               </w:rPr>
-              <w:t>4</w:t>
+              <w:t>10</w:t>
             </w:r>
             <w:r>
               <w:rPr>
@@ -637,7 +637,7 @@
               <w:t xml:space="preserve">31.07.2026 - </w:t>
             </w:r>
             <w:r>
-              <w:t>4</w:t>
+              <w:t>10</w:t>
             </w:r>
             <w:r>
               <w:t>.</w:t>
@@ -659,19 +659,10 @@
           </w:tcPr>
           <w:p>
             <w:r>
-              <w:t>4</w:t>
-            </w:r>
-            <w:r>
-              <w:t>.</w:t>
-            </w:r>
-            <w:r>
-              <w:t>08</w:t>
-            </w:r>
-            <w:r>
-              <w:t>.</w:t>
-            </w:r>
-            <w:r>
-              <w:t>2026</w:t>
+              <w:t>10</w:t>
+            </w:r>
+            <w:r>
+              <w:t>.08.2026</w:t>
             </w:r>
           </w:p>
         </w:tc>
@@ -1535,10 +1526,7 @@
             </w:r>
             <w:proofErr w:type="spellEnd"/>
             <w:r>
-              <w:t xml:space="preserve"> HDG.</w:t>
-            </w:r>
-            <w:r>
-              <w:t xml:space="preserve"> Cena końcowa oraz sumy wartości w kalkulatorze, na liście ofert i w PDF są od teraz zaokrąglane w górę do pełnej jednostki waluty - świadoma decyzja biznesowa, żeby nigdy nie zaniżyć ceny wobec klienta.</w:t>
+              <w:t xml:space="preserve"> HDG. Cena końcowa oraz sumy wartości w kalkulatorze, na liście ofert i w PDF są od teraz zaokrąglane w górę do pełnej jednostki waluty - świadoma decyzja biznesowa, żeby nigdy nie zaniżyć ceny wobec klienta.</w:t>
             </w:r>
           </w:p>
         </w:tc>
@@ -1569,7 +1557,19 @@
           </w:tcPr>
           <w:p>
             <w:r>
-              <w:t>16.07.2026 - 5.08.2026</w:t>
+              <w:t xml:space="preserve">16.07.2026 - </w:t>
+            </w:r>
+            <w:r>
+              <w:t>31</w:t>
+            </w:r>
+            <w:r>
+              <w:t>.0</w:t>
+            </w:r>
+            <w:r>
+              <w:t>7</w:t>
+            </w:r>
+            <w:r>
+              <w:t>.2026</w:t>
             </w:r>
           </w:p>
         </w:tc>
@@ -2676,6 +2676,7 @@
                 <w:b/>
                 <w:color w:val="1F2A44"/>
               </w:rPr>
+              <w:lastRenderedPageBreak/>
               <w:t>1.0</w:t>
             </w:r>
           </w:p>
@@ -2822,7 +2823,6 @@
           <w:color w:val="2B57A6"/>
           <w:sz w:val="26"/>
         </w:rPr>
-        <w:lastRenderedPageBreak/>
         <w:t>Zmiany</w:t>
       </w:r>
       <w:proofErr w:type="spellEnd"/>
@@ -3924,7 +3924,7 @@
       <w:tr>
         <w:tc>
           <w:tcPr>
-            <w:tcW w:type="dxa" w:w="1948"/>
+            <w:tcW w:w="1948" w:type="dxa"/>
           </w:tcPr>
           <w:p>
             <w:r>
@@ -3934,7 +3934,7 @@
         </w:tc>
         <w:tc>
           <w:tcPr>
-            <w:tcW w:type="dxa" w:w="6908"/>
+            <w:tcW w:w="6908" w:type="dxa"/>
           </w:tcPr>
           <w:p>
             <w:r>
@@ -5145,6 +5145,7 @@
             </w:r>
             <w:proofErr w:type="spellStart"/>
             <w:r>
+              <w:lastRenderedPageBreak/>
               <w:t>telefon</w:t>
             </w:r>
             <w:proofErr w:type="spellEnd"/>
@@ -5282,6 +5283,7 @@
           <w:p>
             <w:proofErr w:type="spellStart"/>
             <w:r>
+              <w:lastRenderedPageBreak/>
               <w:t>Poprawka</w:t>
             </w:r>
             <w:proofErr w:type="spellEnd"/>
@@ -5889,7 +5891,6 @@
             </w:r>
             <w:proofErr w:type="spellStart"/>
             <w:r>
-              <w:lastRenderedPageBreak/>
               <w:t>ustawień</w:t>
             </w:r>
             <w:proofErr w:type="spellEnd"/>
@@ -6062,7 +6063,7 @@
       <w:tr>
         <w:tc>
           <w:tcPr>
-            <w:tcW w:type="dxa" w:w="1967"/>
+            <w:tcW w:w="1967" w:type="dxa"/>
           </w:tcPr>
           <w:p>
             <w:r>
@@ -6072,7 +6073,7 @@
         </w:tc>
         <w:tc>
           <w:tcPr>
-            <w:tcW w:type="dxa" w:w="6889"/>
+            <w:tcW w:w="6889" w:type="dxa"/>
           </w:tcPr>
           <w:p>
             <w:r>
@@ -6084,7 +6085,7 @@
       <w:tr>
         <w:tc>
           <w:tcPr>
-            <w:tcW w:type="dxa" w:w="1967"/>
+            <w:tcW w:w="1967" w:type="dxa"/>
           </w:tcPr>
           <w:p>
             <w:r>
@@ -6094,7 +6095,7 @@
         </w:tc>
         <w:tc>
           <w:tcPr>
-            <w:tcW w:type="dxa" w:w="6889"/>
+            <w:tcW w:w="6889" w:type="dxa"/>
           </w:tcPr>
           <w:p>
             <w:r>
@@ -6115,7 +6116,6 @@
           <w:color w:val="2B57A6"/>
           <w:sz w:val="26"/>
         </w:rPr>
-        <w:lastRenderedPageBreak/>
         <w:t>Zarządzanie</w:t>
       </w:r>
       <w:proofErr w:type="spellEnd"/>
@@ -7464,6 +7464,7 @@
           <w:color w:val="2B57A6"/>
           <w:sz w:val="26"/>
         </w:rPr>
+        <w:lastRenderedPageBreak/>
         <w:t>Interfejs</w:t>
       </w:r>
       <w:proofErr w:type="spellEnd"/>
@@ -8363,7 +8364,6 @@
       </w:pPr>
       <w:proofErr w:type="spellStart"/>
       <w:r>
-        <w:lastRenderedPageBreak/>
         <w:t>Wysyłka</w:t>
       </w:r>
       <w:proofErr w:type="spellEnd"/>
@@ -8511,46 +8511,6 @@
       <w:pPr>
         <w:pStyle w:val="Listapunktowana"/>
       </w:pPr>
-      <w:proofErr w:type="spellStart"/>
-      <w:proofErr w:type="spellEnd"/>
-      <w:proofErr w:type="spellStart"/>
-      <w:proofErr w:type="spellEnd"/>
-      <w:proofErr w:type="spellStart"/>
-      <w:proofErr w:type="spellEnd"/>
-      <w:proofErr w:type="spellStart"/>
-      <w:proofErr w:type="spellEnd"/>
-      <w:proofErr w:type="spellStart"/>
-      <w:proofErr w:type="spellEnd"/>
-      <w:proofErr w:type="spellStart"/>
-      <w:proofErr w:type="spellEnd"/>
-      <w:proofErr w:type="spellStart"/>
-      <w:proofErr w:type="spellEnd"/>
-      <w:proofErr w:type="spellStart"/>
-      <w:proofErr w:type="spellEnd"/>
-      <w:proofErr w:type="spellStart"/>
-      <w:proofErr w:type="spellEnd"/>
-      <w:proofErr w:type="spellStart"/>
-      <w:proofErr w:type="spellEnd"/>
-      <w:proofErr w:type="spellStart"/>
-      <w:proofErr w:type="spellEnd"/>
-      <w:proofErr w:type="spellStart"/>
-      <w:proofErr w:type="spellEnd"/>
-      <w:proofErr w:type="spellStart"/>
-      <w:proofErr w:type="spellEnd"/>
-      <w:proofErr w:type="spellStart"/>
-      <w:proofErr w:type="spellEnd"/>
-      <w:proofErr w:type="spellStart"/>
-      <w:proofErr w:type="spellEnd"/>
-      <w:proofErr w:type="spellStart"/>
-      <w:proofErr w:type="spellEnd"/>
-      <w:proofErr w:type="spellStart"/>
-      <w:proofErr w:type="spellEnd"/>
-      <w:proofErr w:type="spellStart"/>
-      <w:proofErr w:type="spellEnd"/>
-      <w:proofErr w:type="spellStart"/>
-      <w:proofErr w:type="spellEnd"/>
-      <w:proofErr w:type="spellStart"/>
-      <w:proofErr w:type="spellEnd"/>
       <w:r>
         <w:t>Panel „Klienci” zapisuje osobę kontaktową bezpośrednio w danych firmy, ale nie synchronizuje jej z tabelą osób kontaktowych - taki kontakt nie pojawia się w zakładce „Kontakty” do czasu ręcznej edycji w tamtym panelu.</w:t>
       </w:r>

</xml_diff>